<commit_message>
Add editable SIWES report for HiiT Plc built around the IoT Trojan Detector mini project
Shared Word styling moved to docx_common.js; placeholders the student must fill in are highlighted.

Co-Authored-By: Claude Sonnet 5.5 <noreply@anthropic.com>
Claude-Session: https://claude.ai/code/session_017A8GdCk7Ce6yVWggGAy5oq
</commit_message>
<xml_diff>
--- a/docs/IoT-Trojan-Detector-Project-Documentation.docx
+++ b/docs/IoT-Trojan-Detector-Project-Documentation.docx
@@ -7853,8 +7853,8 @@
             <w:r>
               <w:rPr>
                 <w:rFonts w:ascii="Courier New" w:cs="Courier New" w:eastAsia="Courier New" w:hAnsi="Courier New"/>
-                <w:sz w:val="20"/>
-                <w:szCs w:val="20"/>
+                <w:sz w:val="18"/>
+                <w:szCs w:val="18"/>
               </w:rPr>
               <w:t xml:space="preserve">flows</w:t>
             </w:r>
@@ -7868,8 +7868,8 @@
             <w:r>
               <w:rPr>
                 <w:rFonts w:ascii="Courier New" w:cs="Courier New" w:eastAsia="Courier New" w:hAnsi="Courier New"/>
-                <w:sz w:val="20"/>
-                <w:szCs w:val="20"/>
+                <w:sz w:val="18"/>
+                <w:szCs w:val="18"/>
               </w:rPr>
               <w:t xml:space="preserve">baseline</w:t>
             </w:r>

</xml_diff>